<commit_message>
Updates to component view
</commit_message>
<xml_diff>
--- a/DD/component_view.docx
+++ b/DD/component_view.docx
@@ -826,21 +826,26 @@
         <w:rPr>
           <w:lang w:val="en-US"/>
         </w:rPr>
-        <w:t>,</w:t>
-      </w:r>
-      <w:r>
-        <w:rPr>
-          <w:lang w:val="en-US"/>
-        </w:rPr>
-        <w:t xml:space="preserve"> responsible for handling data access. The chosen technology is Elastic Search, which is particularly suited for full-text search and keyword matching across CV and internship documents, in addition to efficient storage/retrieval of JSON format data.</w:t>
-      </w:r>
-    </w:p>
-    <w:p>
-      <w:pPr>
-        <w:rPr>
-          <w:lang w:val="en-US"/>
-        </w:rPr>
-      </w:pPr>
+        <w:t xml:space="preserve">, responsible for handling data access. The chosen technology is </w:t>
+      </w:r>
+      <w:r>
+        <w:rPr>
+          <w:lang w:val="en-US"/>
+        </w:rPr>
+        <w:t>MondoDB</w:t>
+      </w:r>
+      <w:r>
+        <w:rPr>
+          <w:lang w:val="en-US"/>
+        </w:rPr>
+        <w:t xml:space="preserve">, </w:t>
+      </w:r>
+      <w:r>
+        <w:rPr>
+          <w:lang w:val="en-US"/>
+        </w:rPr>
+        <w:t>suitable for efficient and scalable storage of structured and unstructured data in JSON format. It also offers full-text search capabilities (Atlas Search), particularly useful in the recommendation process.</w:t>
+      </w:r>
     </w:p>
     <w:p>
       <w:pPr>

</xml_diff>